<commit_message>
Fix: ricostruita la struttura XML w:r/w:t nel documento Word Guida_Sviluppatore_AQI02.docx per completa visibilita in Word
</commit_message>
<xml_diff>
--- a/Guida_Sviluppatore_AQI02.docx
+++ b/Guida_Sviluppatore_AQI02.docx
@@ -34,684 +34,548 @@
 <w:document xmlns:wpc="http://schemas.microsoft.com/office/word/2010/wordprocessingCanvas" xmlns:cx="http://schemas.microsoft.com/office/drawing/2014/chartex" xmlns:cx1="http://schemas.microsoft.com/office/drawing/2015/9/8/chartex" xmlns:cx2="http://schemas.microsoft.com/office/drawing/2015/10/21/chartex" xmlns:cx3="http://schemas.microsoft.com/office/drawing/2016/5/9/chartex" xmlns:cx4="http://schemas.microsoft.com/office/drawing/2016/5/10/chartex" xmlns:cx5="http://schemas.microsoft.com/office/drawing/2016/5/11/chartex" xmlns:cx6="http://schemas.microsoft.com/office/drawing/2016/5/12/chartex" xmlns:cx7="http://schemas.microsoft.com/office/drawing/2016/5/13/chartex" xmlns:cx8="http://schemas.microsoft.com/office/drawing/2016/5/14/chartex" xmlns:mc="http://schemas.openxmlformats.org/markup-compatibility/2006" xmlns:aink="http://schemas.microsoft.com/office/drawing/2016/ink" xmlns:am3d="http://schemas.microsoft.com/office/drawing/2017/model3d" xmlns:o="urn:schemas-microsoft-com:office:office" xmlns:oel="http://schemas.microsoft.com/office/2019/extlst" xmlns:r="http://schemas.openxmlformats.org/officeDocument/2006/relationships" xmlns:m="http://schemas.openxmlformats.org/officeDocument/2006/math" xmlns:v="urn:schemas-microsoft-com:vml" xmlns:wp14="http://schemas.microsoft.com/office/word/2010/wordprocessingDrawing" xmlns:wp="http://schemas.openxmlformats.org/drawingml/2006/wordprocessingDrawing" xmlns:w10="urn:schemas-microsoft-com:office:word" xmlns:w="http://schemas.openxmlformats.org/wordprocessingml/2006/main" xmlns:w14="http://schemas.microsoft.com/office/word/2010/wordml" xmlns:w15="http://schemas.microsoft.com/office/word/2012/wordml" xmlns:w16cex="http://schemas.microsoft.com/office/word/2018/wordml/cex" xmlns:w16cid="http://schemas.microsoft.com/office/word/2016/wordml/cid" xmlns:w16="http://schemas.microsoft.com/office/word/2018/wordml" xmlns:w16du="http://schemas.microsoft.com/office/word/2023/wordml/word16du" xmlns:w16sdtdh="http://schemas.microsoft.com/office/word/2020/wordml/sdtdatahash" xmlns:w16sdtfl="http://schemas.microsoft.com/office/word/2024/wordml/sdtformatlock" xmlns:w16se="http://schemas.microsoft.com/office/word/2015/wordml/symex" xmlns:wpg="http://schemas.microsoft.com/office/word/2010/wordprocessingGroup" xmlns:wpi="http://schemas.microsoft.com/office/word/2010/wordprocessingInk" xmlns:wne="http://schemas.microsoft.com/office/word/2006/wordml" xmlns:wps="http://schemas.microsoft.com/office/word/2010/wordprocessingShape" mc:Ignorable="w14 w15 w16se w16cid w16 w16cex w16sdtdh w16sdtfl w16du wp14">
   <w:body>
     <w:p>
-      <w:pPr>
-        <w:spacing w:before="800"/>
-      </w:pPr>
-    </w:p>
-    <w:p>
-      <w:pPr>
-        <w:spacing w:before="800"/>
-      </w:pPr>
-    </w:p>
-    <w:p>
-      <w:pPr>
-        <w:spacing w:before="800"/>
-      </w:pPr>
-    </w:p>
-    <w:p>
-      <w:pPr>
-        <w:spacing w:before="800"/>
-      </w:pPr>
-    </w:p>
-    <w:p>
-      <w:pPr>
-        <w:spacing w:before="800"/>
-      </w:pPr>
-    </w:p>
-    <w:p>
-      <w:pPr>
-        <w:spacing w:before="800"/>
-      </w:pPr>
-    </w:p>
-    <w:p>
-      <w:pPr>
-        <w:spacing w:before="800"/>
-      </w:pPr>
-    </w:p>
-    <w:p>
-      <w:pPr>
-        <w:spacing w:before="800"/>
-      </w:pPr>
-    </w:p>
-    <w:p>
-      <w:pPr>
-        <w:spacing w:before="800"/>
-      </w:pPr>
-    </w:p>
-    <w:p>
-      <w:pPr>
-        <w:spacing w:before="800"/>
-      </w:pPr>
-    </w:p>
-    <w:p>
-      <w:pPr>
-        <w:spacing w:before="800"/>
-      </w:pPr>
-    </w:p>
-    <w:p>
-      <w:pPr>
-        <w:spacing w:before="800"/>
-      </w:pPr>
-    </w:p>
-    <w:p>
-      <w:pPr>
-        <w:spacing w:before="800"/>
-      </w:pPr>
-    </w:p>
-    <w:p>
-      <w:pPr>
-        <w:spacing w:before="800"/>
-      </w:pPr>
-    </w:p>
-    <w:p>
-      <w:pPr>
-        <w:spacing w:before="800"/>
-      </w:pPr>
-    </w:p>
-    <w:p>
-      <w:pPr>
-        <w:spacing w:before="800"/>
-      </w:pPr>
-    </w:p>
-    <w:p>
-      <w:pPr>
-        <w:spacing w:before="800"/>
-      </w:pPr>
-    </w:p>
-    <w:p>
-      <w:pPr>
-        <w:spacing w:before="800"/>
-      </w:pPr>
-    </w:p>
-    <w:p>
-      <w:pPr>
-        <w:spacing w:before="800"/>
-      </w:pPr>
-    </w:p>
-    <w:p>
-      <w:pPr>
-        <w:spacing w:before="800"/>
-      </w:pPr>
-    </w:p>
-    <w:p>
-      <w:pPr>
-        <w:spacing w:before="800"/>
-      </w:pPr>
-    </w:p>
-    <w:p>
-      <w:pPr>
-        <w:spacing w:before="800"/>
-      </w:pPr>
-    </w:p>
-    <w:p>
-      <w:pPr>
-        <w:spacing w:before="800"/>
-      </w:pPr>
-    </w:p>
-    <w:p>
-      <w:pPr>
-        <w:spacing w:before="800"/>
-      </w:pPr>
-    </w:p>
-    <w:p>
-      <w:pPr>
-        <w:spacing w:before="800"/>
-      </w:pPr>
-    </w:p>
-    <w:p>
-      <w:pPr>
-        <w:spacing w:before="800"/>
-      </w:pPr>
-    </w:p>
-    <w:p>
-      <w:pPr>
-        <w:spacing w:before="800"/>
-      </w:pPr>
-    </w:p>
-    <w:p>
-      <w:pPr>
-        <w:spacing w:before="800"/>
-      </w:pPr>
-    </w:p>
-    <w:p>
-      <w:pPr>
-        <w:spacing w:before="800"/>
-      </w:pPr>
-    </w:p>
-    <w:p>
-      <w:pPr>
-        <w:spacing w:before="800"/>
-      </w:pPr>
-    </w:p>
-    <w:p>
-      <w:pPr>
-        <w:spacing w:before="800"/>
-      </w:pPr>
-    </w:p>
-    <w:p>
-      <w:pPr>
-        <w:spacing w:before="800"/>
-      </w:pPr>
-    </w:p>
-    <w:p>
-      <w:pPr>
-        <w:spacing w:before="800"/>
-      </w:pPr>
-    </w:p>
-    <w:p>
-      <w:pPr>
-        <w:spacing w:before="800"/>
-      </w:pPr>
-    </w:p>
-    <w:p>
-      <w:pPr>
-        <w:spacing w:before="800"/>
-      </w:pPr>
-    </w:p>
-    <w:p>
-      <w:pPr>
-        <w:spacing w:before="800"/>
-      </w:pPr>
-    </w:p>
-    <w:p>
-      <w:pPr>
-        <w:spacing w:before="800"/>
-      </w:pPr>
-    </w:p>
-    <w:p>
-      <w:pPr>
-        <w:spacing w:before="800"/>
-      </w:pPr>
-    </w:p>
-    <w:p>
-      <w:pPr>
-        <w:spacing w:before="800"/>
-      </w:pPr>
-    </w:p>
-    <w:p>
-      <w:pPr>
-        <w:spacing w:before="800"/>
-      </w:pPr>
-    </w:p>
-    <w:p>
-      <w:pPr>
-        <w:spacing w:before="800"/>
-      </w:pPr>
-    </w:p>
-    <w:p>
-      <w:pPr>
-        <w:spacing w:before="800"/>
-      </w:pPr>
-    </w:p>
-    <w:p>
-      <w:pPr>
-        <w:spacing w:before="800"/>
-      </w:pPr>
-    </w:p>
-    <w:p>
-      <w:pPr>
-        <w:spacing w:before="800"/>
-      </w:pPr>
-    </w:p>
-    <w:p>
-      <w:pPr>
-        <w:spacing w:before="800"/>
-      </w:pPr>
-    </w:p>
-    <w:p>
-      <w:pPr>
-        <w:spacing w:before="800"/>
-      </w:pPr>
-    </w:p>
-    <w:p>
-      <w:pPr>
-        <w:spacing w:before="800"/>
-      </w:pPr>
-    </w:p>
-    <w:p>
-      <w:pPr>
-        <w:spacing w:before="800"/>
-      </w:pPr>
-    </w:p>
-    <w:p>
-      <w:pPr>
-        <w:spacing w:before="800"/>
-      </w:pPr>
-    </w:p>
-    <w:p>
-      <w:pPr>
-        <w:spacing w:before="800"/>
-      </w:pPr>
-    </w:p>
-    <w:p>
-      <w:pPr>
-        <w:spacing w:before="800"/>
-      </w:pPr>
-    </w:p>
-    <w:p>
-      <w:pPr>
-        <w:spacing w:before="800"/>
-      </w:pPr>
-    </w:p>
-    <w:p>
-      <w:pPr>
-        <w:spacing w:before="800"/>
-      </w:pPr>
-    </w:p>
-    <w:p>
-      <w:pPr>
-        <w:spacing w:before="800"/>
-      </w:pPr>
-    </w:p>
-    <w:p>
-      <w:pPr>
-        <w:spacing w:before="800"/>
-      </w:pPr>
-    </w:p>
-    <w:p>
-      <w:pPr>
-        <w:spacing w:before="800"/>
-      </w:pPr>
-    </w:p>
-    <w:p>
-      <w:pPr>
-        <w:spacing w:before="800"/>
-      </w:pPr>
-    </w:p>
-    <w:p>
-      <w:pPr>
-        <w:spacing w:before="800"/>
-      </w:pPr>
-    </w:p>
-    <w:p>
-      <w:pPr>
-        <w:spacing w:before="800"/>
-      </w:pPr>
-    </w:p>
-    <w:p>
-      <w:pPr>
-        <w:spacing w:before="800"/>
-      </w:pPr>
-    </w:p>
-    <w:p>
-      <w:pPr>
-        <w:spacing w:before="800"/>
-      </w:pPr>
-    </w:p>
-    <w:p>
-      <w:pPr>
-        <w:spacing w:before="800"/>
-      </w:pPr>
-    </w:p>
-    <w:p>
-      <w:pPr>
-        <w:spacing w:before="800"/>
-      </w:pPr>
-    </w:p>
-    <w:p>
-      <w:pPr>
-        <w:spacing w:before="800"/>
-      </w:pPr>
-    </w:p>
-    <w:p>
-      <w:pPr>
-        <w:spacing w:before="800"/>
-      </w:pPr>
-    </w:p>
-    <w:p>
-      <w:pPr>
-        <w:spacing w:before="800"/>
-      </w:pPr>
-    </w:p>
-    <w:p>
-      <w:pPr>
-        <w:spacing w:before="800"/>
-      </w:pPr>
-    </w:p>
-    <w:p>
-      <w:pPr>
-        <w:spacing w:before="800"/>
-      </w:pPr>
-    </w:p>
-    <w:p>
-      <w:pPr>
-        <w:spacing w:before="800"/>
-      </w:pPr>
-    </w:p>
-    <w:p>
-      <w:pPr>
-        <w:spacing w:before="800"/>
-      </w:pPr>
-    </w:p>
-    <w:p>
-      <w:pPr>
-        <w:spacing w:before="800"/>
-      </w:pPr>
-    </w:p>
-    <w:p>
-      <w:pPr>
-        <w:spacing w:before="800"/>
-      </w:pPr>
-    </w:p>
-    <w:p>
-      <w:pPr>
-        <w:spacing w:before="800"/>
-      </w:pPr>
-    </w:p>
-    <w:p>
-      <w:pPr>
-        <w:spacing w:before="800"/>
-      </w:pPr>
-    </w:p>
-    <w:p>
-      <w:pPr>
-        <w:spacing w:before="800"/>
-      </w:pPr>
-    </w:p>
-    <w:p>
-      <w:pPr>
-        <w:spacing w:before="800"/>
-      </w:pPr>
-    </w:p>
-    <w:p>
-      <w:pPr>
-        <w:spacing w:before="800"/>
-      </w:pPr>
-    </w:p>
-    <w:p>
-      <w:pPr>
-        <w:spacing w:before="800"/>
-      </w:pPr>
-    </w:p>
-    <w:p>
-      <w:pPr>
-        <w:spacing w:before="800"/>
-      </w:pPr>
-    </w:p>
-    <w:p>
-      <w:pPr>
-        <w:spacing w:before="800"/>
-      </w:pPr>
-    </w:p>
-    <w:p>
-      <w:pPr>
-        <w:spacing w:before="800"/>
-      </w:pPr>
-    </w:p>
-    <w:p>
-      <w:pPr>
-        <w:spacing w:before="800"/>
-      </w:pPr>
-    </w:p>
-    <w:p>
-      <w:pPr>
-        <w:spacing w:before="800"/>
-      </w:pPr>
-    </w:p>
-    <w:p>
-      <w:pPr>
-        <w:spacing w:before="800"/>
-      </w:pPr>
-    </w:p>
-    <w:p>
-      <w:pPr>
-        <w:spacing w:before="800"/>
-      </w:pPr>
-    </w:p>
-    <w:p>
-      <w:pPr>
-        <w:spacing w:before="800"/>
-      </w:pPr>
-    </w:p>
-    <w:p>
-      <w:pPr>
-        <w:spacing w:before="800"/>
-      </w:pPr>
-    </w:p>
-    <w:p>
-      <w:pPr>
-        <w:spacing w:before="800"/>
-      </w:pPr>
-    </w:p>
-    <w:p>
-      <w:pPr>
-        <w:spacing w:before="800"/>
-      </w:pPr>
-    </w:p>
-    <w:p>
-      <w:pPr>
-        <w:spacing w:before="800"/>
-      </w:pPr>
-    </w:p>
-    <w:p>
-      <w:pPr>
-        <w:spacing w:before="800"/>
-      </w:pPr>
-    </w:p>
-    <w:p>
-      <w:pPr>
-        <w:spacing w:before="800"/>
-      </w:pPr>
-    </w:p>
-    <w:p>
-      <w:pPr>
-        <w:spacing w:before="800"/>
-      </w:pPr>
-    </w:p>
-    <w:p>
-      <w:pPr>
-        <w:spacing w:before="800"/>
-      </w:pPr>
-    </w:p>
-    <w:p>
-      <w:pPr>
-        <w:spacing w:before="800"/>
-      </w:pPr>
-    </w:p>
-    <w:p>
-      <w:pPr>
-        <w:spacing w:before="800"/>
-      </w:pPr>
-    </w:p>
-    <w:p>
-      <w:pPr>
-        <w:spacing w:before="800"/>
-      </w:pPr>
-    </w:p>
-    <w:p>
-      <w:pPr>
-        <w:spacing w:before="800"/>
-      </w:pPr>
-    </w:p>
-    <w:p>
-      <w:pPr>
-        <w:spacing w:before="800"/>
-      </w:pPr>
-    </w:p>
-    <w:p>
-      <w:pPr>
-        <w:spacing w:before="800"/>
-      </w:pPr>
-    </w:p>
-    <w:p>
-      <w:pPr>
-        <w:spacing w:before="800"/>
-      </w:pPr>
-    </w:p>
-    <w:p>
-      <w:pPr>
-        <w:spacing w:before="800"/>
-      </w:pPr>
-    </w:p>
-    <w:p>
-      <w:pPr>
-        <w:spacing w:before="800"/>
-      </w:pPr>
-    </w:p>
-    <w:p>
-      <w:pPr>
-        <w:spacing w:before="800"/>
-      </w:pPr>
-    </w:p>
-    <w:p>
-      <w:pPr>
-        <w:spacing w:before="800"/>
-      </w:pPr>
-    </w:p>
-    <w:p>
-      <w:pPr>
-        <w:spacing w:before="800"/>
-      </w:pPr>
-    </w:p>
-    <w:p>
-      <w:pPr>
-        <w:spacing w:before="800"/>
-      </w:pPr>
-    </w:p>
-    <w:p>
-      <w:pPr>
-        <w:spacing w:before="800"/>
-      </w:pPr>
-    </w:p>
-    <w:p>
-      <w:pPr>
-        <w:spacing w:before="800"/>
-      </w:pPr>
-    </w:p>
-    <w:p>
-      <w:pPr>
-        <w:spacing w:before="800"/>
-      </w:pPr>
-    </w:p>
-    <w:p>
-      <w:pPr>
-        <w:spacing w:before="800"/>
-      </w:pPr>
-    </w:p>
-    <w:p>
-      <w:pPr>
-        <w:spacing w:before="800"/>
-      </w:pPr>
-    </w:p>
-    <w:p>
-      <w:pPr>
-        <w:spacing w:before="800"/>
-      </w:pPr>
-    </w:p>
-    <w:p>
-      <w:pPr>
-        <w:spacing w:before="800"/>
-      </w:pPr>
-    </w:p>
-    <w:p>
-      <w:pPr>
-        <w:spacing w:before="800"/>
-      </w:pPr>
-    </w:p>
-    <w:p>
-      <w:pPr>
-        <w:spacing w:before="800"/>
-      </w:pPr>
-    </w:p>
-    <w:p>
-      <w:pPr>
-        <w:spacing w:before="800"/>
-      </w:pPr>
-    </w:p>
-    <w:p>
-      <w:pPr>
-        <w:spacing w:before="800"/>
-      </w:pPr>
-    </w:p>
-    <w:p>
-      <w:pPr>
-        <w:spacing w:before="800"/>
-      </w:pPr>
-    </w:p>
-    <w:p>
-      <w:pPr>
-        <w:spacing w:before="800"/>
-      </w:pPr>
-    </w:p>
-    <w:p>
-      <w:pPr>
-        <w:spacing w:before="800"/>
-      </w:pPr>
-    </w:p>
-    <w:p>
-      <w:pPr>
-        <w:spacing w:before="800"/>
-      </w:pPr>
-    </w:p>
-    <w:p>
-      <w:pPr>
-        <w:spacing w:before="800"/>
-      </w:pPr>
-    </w:p>
-    <w:p>
-      <w:pPr>
-        <w:spacing w:before="800"/>
-      </w:pPr>
-    </w:p>
-    <w:p>
-      <w:pPr>
-        <w:spacing w:before="800"/>
-      </w:pPr>
-    </w:p>
-    <w:p>
-      <w:pPr>
-        <w:spacing w:before="800"/>
-      </w:pPr>
-    </w:p>
-    <w:p>
-      <w:pPr>
-        <w:spacing w:before="800"/>
-      </w:pPr>
-    </w:p>
-    <w:p>
-      <w:pPr>
-        <w:spacing w:before="800"/>
-      </w:pPr>
-    </w:p>
-    <w:p>
-      <w:pPr>
-        <w:spacing w:before="800"/>
-      </w:pPr>
-    </w:p>
-    <w:p>
-      <w:pPr>
-        <w:spacing w:before="800"/>
-      </w:pPr>
-    </w:p>
-    <w:p>
-      <w:pPr>
-        <w:spacing w:before="800"/>
-      </w:pPr>
-    </w:p>
-    <w:p>
-      <w:pPr>
-        <w:spacing w:before="800"/>
-      </w:pPr>
-    </w:p>
-    <w:p>
-      <w:pPr>
-        <w:spacing w:before="800"/>
-      </w:pPr>
-    </w:p>
-    <w:p>
-      <w:pPr>
-        <w:spacing w:before="800"/>
-      </w:pPr>
-    </w:p>
-    <w:p>
-      <w:pPr>
-        <w:spacing w:before="800"/>
-      </w:pPr>
-    </w:p>
-    <w:p>
-      <w:pPr>
-        <w:spacing w:before="800"/>
-      </w:pPr>
+      <w:r>
+        <w:t xml:space="preserve"># Guida Pratica per lo Sviluppo, Modifica e Aggiornamento della Dashboard AQI02</w:t>
+      </w:r>
+    </w:p>
+    <w:p/>
+    <w:p>
+      <w:r>
+        <w:t xml:space="preserve">Questa guida fornisce tutte le istruzioni pratiche e l'architettura tecnica per personalizzare, manutenerare ed aggiornare la dashboard per il monitoraggio IoT della qualità dell'aria **AQI02**.</w:t>
+      </w:r>
+    </w:p>
+    <w:p/>
+    <w:p>
+      <w:r>
+        <w:t xml:space="preserve">---</w:t>
+      </w:r>
+    </w:p>
+    <w:p/>
+    <w:p>
+      <w:r>
+        <w:t xml:space="preserve">## 1. Mappa dei File e Architettura del Progetto</w:t>
+      </w:r>
+    </w:p>
+    <w:p/>
+    <w:p>
+      <w:r>
+        <w:t xml:space="preserve">Il progetto è strutturato in modo modulare con codice in Vanilla JavaScript (ES6 Modules) e CSS puro per la massima velocità e pulizia senza dipendenze pesanti.</w:t>
+      </w:r>
+    </w:p>
+    <w:p/>
+    <w:p>
+      <w:r>
+        <w:t xml:space="preserve">```</w:t>
+      </w:r>
+    </w:p>
+    <w:p>
+      <w:r>
+        <w:t xml:space="preserve">New_Dashboard/</w:t>
+      </w:r>
+    </w:p>
+    <w:p>
+      <w:r>
+        <w:t xml:space="preserve">├── index.html                           # Struttura HTML principale della dashboard</w:t>
+      </w:r>
+    </w:p>
+    <w:p>
+      <w:r>
+        <w:t xml:space="preserve">├── README.md                            # Guida / Manuale operativo principale su GitHub</w:t>
+      </w:r>
+    </w:p>
+    <w:p>
+      <w:r>
+        <w:t xml:space="preserve">├── AQI_Dashboard_Operating_Manual_v07.md # Manuale operativo v07 in formato Markdown</w:t>
+      </w:r>
+    </w:p>
+    <w:p>
+      <w:r>
+        <w:t xml:space="preserve">├── AQI_Dashboard_Operating_Manual_v07.docx # Manuale operativo v07 in formato Word (.docx)</w:t>
+      </w:r>
+    </w:p>
+    <w:p>
+      <w:r>
+        <w:t xml:space="preserve">├── GUIDA_SVILUPPATORE.md                # Questa guida tecnica per lo sviluppatore</w:t>
+      </w:r>
+    </w:p>
+    <w:p>
+      <w:r>
+        <w:t xml:space="preserve">├── assets/                              # Risorse grafiche e immagini</w:t>
+      </w:r>
+    </w:p>
+    <w:p>
+      <w:r>
+        <w:t xml:space="preserve">│   ├── LOGO_BCV_3D.png                  # Favicon e Logo 3D ufficiale del dispositivo</w:t>
+      </w:r>
+    </w:p>
+    <w:p>
+      <w:r>
+        <w:t xml:space="preserve">│   ├── Limiti-EEA.png                   # Immagine tabella standard europeo EEA</w:t>
+      </w:r>
+    </w:p>
+    <w:p>
+      <w:r>
+        <w:t xml:space="preserve">│   └── Limiti-EPA.png                   # Immagine tabella standard americano EPA</w:t>
+      </w:r>
+    </w:p>
+    <w:p>
+      <w:r>
+        <w:t xml:space="preserve">├── css/                                 # Fogli di stile CSS</w:t>
+      </w:r>
+    </w:p>
+    <w:p>
+      <w:r>
+        <w:t xml:space="preserve">│   ├── main.css                         # Variabili globali, reset e temi (Dark &amp; Chiaro Pastello)</w:t>
+      </w:r>
+    </w:p>
+    <w:p>
+      <w:r>
+        <w:t xml:space="preserve">│   ├── header.css                       # Barra superiore, selettori, geolocalizzazione, pulsante Tema Ocra</w:t>
+      </w:r>
+    </w:p>
+    <w:p>
+      <w:r>
+        <w:t xml:space="preserve">│   ├── kpi.css                          # Layout a 8 colonne per le card KPI e tipografia</w:t>
+      </w:r>
+    </w:p>
+    <w:p>
+      <w:r>
+        <w:t xml:space="preserve">│   ├── charts.css                       # Stili e layout dei contenitori dei grafici Chart.js</w:t>
+      </w:r>
+    </w:p>
+    <w:p>
+      <w:r>
+        <w:t xml:space="preserve">│   └── modal.css                        # Stile delle finestre modali di aiuto e dettagli</w:t>
+      </w:r>
+    </w:p>
+    <w:p>
+      <w:r>
+        <w:t xml:space="preserve">└── js/                                  # Moduli JavaScript (ES6)</w:t>
+      </w:r>
+    </w:p>
+    <w:p>
+      <w:r>
+        <w:t xml:space="preserve">    ├── config.js                        # CONFIGURAZIONE CENTRALE (Centraline, API, Soglie)</w:t>
+      </w:r>
+    </w:p>
+    <w:p>
+      <w:r>
+        <w:t xml:space="preserve">    ├── app.js                           # Controller principale, eventi UI, init e geocoding</w:t>
+      </w:r>
+    </w:p>
+    <w:p>
+      <w:r>
+        <w:t xml:space="preserve">    ├── api.js                           # Chiamate REST API a ThingSpeak (recupero dati e RSSI)</w:t>
+      </w:r>
+    </w:p>
+    <w:p>
+      <w:r>
+        <w:t xml:space="preserve">    ├── charts.js                        # Rendering e distruzione dei grafici interattivi (Chart.js)</w:t>
+      </w:r>
+    </w:p>
+    <w:p>
+      <w:r>
+        <w:t xml:space="preserve">    ├── calculations.js                  # Algoritmi AQI (EEA/EPA), medie mobili 24h, delta VOC</w:t>
+      </w:r>
+    </w:p>
+    <w:p>
+      <w:r>
+        <w:t xml:space="preserve">    ├── storage.js                       # Salvataggio/ripristino preferenze su localStorage per centralina</w:t>
+      </w:r>
+    </w:p>
+    <w:p>
+      <w:r>
+        <w:t xml:space="preserve">    ├── csv.js                           # Logica di esportazione file CSV per Excel</w:t>
+      </w:r>
+    </w:p>
+    <w:p>
+      <w:r>
+        <w:t xml:space="preserve">    └── modal.js                         # Gestione apertura/chiusura delle finestre dialoghi modali</w:t>
+      </w:r>
+    </w:p>
+    <w:p>
+      <w:r>
+        <w:t xml:space="preserve">```</w:t>
+      </w:r>
+    </w:p>
+    <w:p/>
+    <w:p>
+      <w:r>
+        <w:t xml:space="preserve">---</w:t>
+      </w:r>
+    </w:p>
+    <w:p/>
+    <w:p>
+      <w:r>
+        <w:t xml:space="preserve">## 2. Come Aggiungere o Modificare una Centralina IoT</w:t>
+      </w:r>
+    </w:p>
+    <w:p/>
+    <w:p>
+      <w:r>
+        <w:t xml:space="preserve">Tutte le centraline monitorate sono definite all'interno del file **[`js/config.js`](file:///c:/Users/Maria%20Luisa/Desktop/New_Dashboard/js/config.js)**.</w:t>
+      </w:r>
+    </w:p>
+    <w:p/>
+    <w:p>
+      <w:r>
+        <w:t xml:space="preserve">### Per aggiungere una nuova centralina:</w:t>
+      </w:r>
+    </w:p>
+    <w:p>
+      <w:r>
+        <w:t xml:space="preserve">1. Apri il file `js/config.js`.</w:t>
+      </w:r>
+    </w:p>
+    <w:p>
+      <w:r>
+        <w:t xml:space="preserve">2. Individua l'array `STATIONS` ed aggiungi una nuova riga in coda alla lista:</w:t>
+      </w:r>
+    </w:p>
+    <w:p>
+      <w:r>
+        <w:t xml:space="preserve">```javascript</w:t>
+      </w:r>
+    </w:p>
+    <w:p>
+      <w:r>
+        <w:t xml:space="preserve">export const STATIONS = [</w:t>
+      </w:r>
+    </w:p>
+    <w:p>
+      <w:r>
+        <w:t xml:space="preserve">  { id: 2789658, apiKey: '4IMIXLC0RWW9K4PA', name: 'Device N° AQI_01', location: 'Stazione Primaria' },</w:t>
+      </w:r>
+    </w:p>
+    <w:p>
+      <w:r>
+        <w:t xml:space="preserve">  { id: 3412629, apiKey: 'HP8HM37WZ9BAVB4A', name: 'Device N° AQI_02', location: 'Stazione Secondaria' },</w:t>
+      </w:r>
+    </w:p>
+    <w:p>
+      <w:r>
+        <w:t xml:space="preserve">  { id: NUOVO_ID_CANALE, apiKey: 'NUOVA_API_KEY', name: 'Device N° AQI_03', location: 'Nuova Sede' }</w:t>
+      </w:r>
+    </w:p>
+    <w:p>
+      <w:r>
+        <w:t xml:space="preserve">];</w:t>
+      </w:r>
+    </w:p>
+    <w:p>
+      <w:r>
+        <w:t xml:space="preserve">```</w:t>
+      </w:r>
+    </w:p>
+    <w:p>
+      <w:r>
+        <w:t xml:space="preserve">&gt; ⚠️ **IMPORTANTE**: Aggiungi le nuove centraline **sempre in coda all'array** (mai in mezzo) per evitare di disallineare le preferenze salvate dagli utenti nel `localStorage` del browser.</w:t>
+      </w:r>
+    </w:p>
+    <w:p/>
+    <w:p>
+      <w:r>
+        <w:t xml:space="preserve">---</w:t>
+      </w:r>
+    </w:p>
+    <w:p/>
+    <w:p>
+      <w:r>
+        <w:t xml:space="preserve">## 3. Come Modificare i Temi Grafici e lo Stile</w:t>
+      </w:r>
+    </w:p>
+    <w:p/>
+    <w:p>
+      <w:r>
+        <w:t xml:space="preserve">I colori e gli elementi stilistici sono gestiti in modo centralizzato in **[`css/main.css`](file:///c:/Users/Maria%20Luisa/Desktop/New_Dashboard/css/main.css)** tramite variabili CSS e selettori di tema:</w:t>
+      </w:r>
+    </w:p>
+    <w:p/>
+    <w:p>
+      <w:r>
+        <w:t xml:space="preserve">- **Tema Scuro (Default)**: Utilizza lo sfondo scuro glassmorphic `#0b1329`.</w:t>
+      </w:r>
+    </w:p>
+    <w:p>
+      <w:r>
+        <w:t xml:space="preserve">- **Tema Chiaro Pastello**: Attivato dall'attributo `[data-theme="light"]` sul tag `&lt;body&gt;`:</w:t>
+      </w:r>
+    </w:p>
+    <w:p>
+      <w:r>
+        <w:t xml:space="preserve">  - Sfondo principale: `#ebf3f0` (Salvia tenue)</w:t>
+      </w:r>
+    </w:p>
+    <w:p>
+      <w:r>
+        <w:t xml:space="preserve">  - Card e Contenitori: `#ffffff` con bordi `#b8d4e8`</w:t>
+      </w:r>
+    </w:p>
+    <w:p>
+      <w:r>
+        <w:t xml:space="preserve">  - Intestazione Grafici: `#1b4db1` (Blu Reale)</w:t>
+      </w:r>
+    </w:p>
+    <w:p>
+      <w:r>
+        <w:t xml:space="preserve">  - Testi principali: `#003b46` (Blu Notte)</w:t>
+      </w:r>
+    </w:p>
+    <w:p/>
+    <w:p>
+      <w:r>
+        <w:t xml:space="preserve">Per cambiare i colori del Tema Chiaro o Scuro, modifica le regole corrispondenti in `css/main.css`.</w:t>
+      </w:r>
+    </w:p>
+    <w:p/>
+    <w:p>
+      <w:r>
+        <w:t xml:space="preserve">---</w:t>
+      </w:r>
+    </w:p>
+    <w:p/>
+    <w:p>
+      <w:r>
+        <w:t xml:space="preserve">## 4. Come Modificare gli Standard AQI o i Limiti dei Grafici</w:t>
+      </w:r>
+    </w:p>
+    <w:p/>
+    <w:p>
+      <w:r>
+        <w:t xml:space="preserve">- **Soglie EEA ed EPA**: Sono definite in `js/config.js` negli oggetti `EEA_THRESHOLDS` ed `EPA_BREAKPOINTS`.</w:t>
+      </w:r>
+    </w:p>
+    <w:p>
+      <w:r>
+        <w:t xml:space="preserve">- **Limiti e Colori dei Grafici**: Sono definiti in `js/config.js` nell'oggetto `CHART_META`:</w:t>
+      </w:r>
+    </w:p>
+    <w:p>
+      <w:r>
+        <w:t xml:space="preserve">```javascript</w:t>
+      </w:r>
+    </w:p>
+    <w:p>
+      <w:r>
+        <w:t xml:space="preserve">export const CHART_META = {</w:t>
+      </w:r>
+    </w:p>
+    <w:p>
+      <w:r>
+        <w:t xml:space="preserve">  1: { title: 'Umidità', sensor: 'BME680', unit: '%', min: 0, max: 100, color: '#38bdf8' },</w:t>
+      </w:r>
+    </w:p>
+    <w:p>
+      <w:r>
+        <w:t xml:space="preserve">  2: { title: 'Temperatura', sensor: 'BME680', unit: '°C', min: -10, max: 60, color: '#f43f5e' },</w:t>
+      </w:r>
+    </w:p>
+    <w:p>
+      <w:r>
+        <w:t xml:space="preserve">  ...</w:t>
+      </w:r>
+    </w:p>
+    <w:p>
+      <w:r>
+        <w:t xml:space="preserve">};</w:t>
+      </w:r>
+    </w:p>
+    <w:p>
+      <w:r>
+        <w:t xml:space="preserve">```</w:t>
+      </w:r>
+    </w:p>
+    <w:p/>
+    <w:p>
+      <w:r>
+        <w:t xml:space="preserve">---</w:t>
+      </w:r>
+    </w:p>
+    <w:p/>
+    <w:p>
+      <w:r>
+        <w:t xml:space="preserve">## 5. Procedura di Test Locale</w:t>
+      </w:r>
+    </w:p>
+    <w:p/>
+    <w:p>
+      <w:r>
+        <w:t xml:space="preserve">Prima di pubblicare le modifiche su GitHub:</w:t>
+      </w:r>
+    </w:p>
+    <w:p>
+      <w:r>
+        <w:t xml:space="preserve">1. Apri direttamente il file [`index.html`](file:///c:/Users/Maria%20Luisa/Desktop/New_Dashboard/index.html) in un browser web (Google Chrome, Microsoft Edge o Mozilla Firefox).</w:t>
+      </w:r>
+    </w:p>
+    <w:p>
+      <w:r>
+        <w:t xml:space="preserve">2. Apri la **Console per Sviluppatori** del browser (`F12` oppure tasto destro -&gt; *Ispeziona* -&gt; scheda *Console*).</w:t>
+      </w:r>
+    </w:p>
+    <w:p>
+      <w:r>
+        <w:t xml:space="preserve">3. Verifica che non siano presenti errori in rosso (es. `SyntaxError` o `ReferenceError`).</w:t>
+      </w:r>
+    </w:p>
+    <w:p>
+      <w:r>
+        <w:t xml:space="preserve">4. Prova a:</w:t>
+      </w:r>
+    </w:p>
+    <w:p>
+      <w:r>
+        <w:t xml:space="preserve">   - Cambiare centralina dal selettore *"SCEGLI CENTRALINA"*.</w:t>
+      </w:r>
+    </w:p>
+    <w:p>
+      <w:r>
+        <w:t xml:space="preserve">   - Alternare il tema con il pulsante Ocra (`[ ☼ Tema Chiaro ]` / `[ ☼ Tema Scuro ]`).</w:t>
+      </w:r>
+    </w:p>
+    <w:p>
+      <w:r>
+        <w:t xml:space="preserve">   - Selezionare una data nel campo *Data Inizio*.</w:t>
+      </w:r>
+    </w:p>
+    <w:p>
+      <w:r>
+        <w:t xml:space="preserve">   - Esportare il file CSV tramite il pulsante *Estrai CSV*.</w:t>
+      </w:r>
+    </w:p>
+    <w:p/>
+    <w:p>
+      <w:r>
+        <w:t xml:space="preserve">---</w:t>
+      </w:r>
+    </w:p>
+    <w:p/>
+    <w:p>
+      <w:r>
+        <w:t xml:space="preserve">## 6. Procedura per Salvare e Pubblicare su GitHub</w:t>
+      </w:r>
+    </w:p>
+    <w:p/>
+    <w:p>
+      <w:r>
+        <w:t xml:space="preserve">Per sincronizzare il lavoro su GitHub e rendere pubbliche le modifiche sul sito live ([https://giuse-arte.github.io/AQI02/index.html](https://giuse-arte.github.io/AQI02/index.html)):</w:t>
+      </w:r>
+    </w:p>
+    <w:p/>
+    <w:p>
+      <w:r>
+        <w:t xml:space="preserve">Apri il terminale nella cartella del progetto (`c:\Users\Maria Luisa\Desktop\New_Dashboard`) ed esegui i seguenti comandi in sequenza:</w:t>
+      </w:r>
+    </w:p>
+    <w:p/>
+    <w:p>
+      <w:r>
+        <w:t xml:space="preserve">```bash</w:t>
+      </w:r>
+    </w:p>
+    <w:p>
+      <w:r>
+        <w:t xml:space="preserve"># 1. Verifica i file modificati</w:t>
+      </w:r>
+    </w:p>
+    <w:p>
+      <w:r>
+        <w:t xml:space="preserve">git status</w:t>
+      </w:r>
+    </w:p>
+    <w:p/>
+    <w:p>
+      <w:r>
+        <w:t xml:space="preserve"># 2. Aggiungi tutte le modifiche alla staging area</w:t>
+      </w:r>
+    </w:p>
+    <w:p>
+      <w:r>
+        <w:t xml:space="preserve">git add .</w:t>
+      </w:r>
+    </w:p>
+    <w:p/>
+    <w:p>
+      <w:r>
+        <w:t xml:space="preserve"># 3. Crea un commit con una descrizione chiara della modifica</w:t>
+      </w:r>
+    </w:p>
+    <w:p>
+      <w:r>
+        <w:t xml:space="preserve">git commit -m "Descrizione sintetica delle modifiche apportate"</w:t>
+      </w:r>
+    </w:p>
+    <w:p/>
+    <w:p>
+      <w:r>
+        <w:t xml:space="preserve"># 4. Sincronizza con eventuali aggiornamenti remoti</w:t>
+      </w:r>
+    </w:p>
+    <w:p>
+      <w:r>
+        <w:t xml:space="preserve">git pull --rebase origin main</w:t>
+      </w:r>
+    </w:p>
+    <w:p/>
+    <w:p>
+      <w:r>
+        <w:t xml:space="preserve"># 5. Invia le modifiche su GitHub</w:t>
+      </w:r>
+    </w:p>
+    <w:p>
+      <w:r>
+        <w:t xml:space="preserve">git push origin main</w:t>
+      </w:r>
+    </w:p>
+    <w:p>
+      <w:r>
+        <w:t xml:space="preserve">```</w:t>
+      </w:r>
+    </w:p>
+    <w:p/>
+    <w:p>
+      <w:r>
+        <w:t xml:space="preserve">Una volta completato il `git push`, GitHub Pages aggiornerà automaticamente la dashboard online in circa 1-2 minuti.</w:t>
+      </w:r>
+    </w:p>
+    <w:p/>
+    <w:p>
+      <w:r>
+        <w:t xml:space="preserve">---</w:t>
+      </w:r>
+    </w:p>
+    <w:p/>
+    <w:p>
+      <w:r>
+        <w:t xml:space="preserve">## 7. Come Aggiornare il Manuale Operativo</w:t>
+      </w:r>
+    </w:p>
+    <w:p/>
+    <w:p>
+      <w:r>
+        <w:t xml:space="preserve">Se apporti modifiche alle funzionalità della dashboard, aggiorna la documentazione:</w:t>
+      </w:r>
+    </w:p>
+    <w:p/>
+    <w:p>
+      <w:r>
+        <w:t xml:space="preserve">1. **Aggiorna il file Markdown**: Modifica [`README.md`](file:///c:/Users/Maria%20Luisa/Desktop/New_Dashboard/README.md) ed [`AQI_Dashboard_Operating_Manual_v07.md`](file:///c:/Users/Maria%20Luisa/Desktop/New_Dashboard/AQI_Dashboard_Operating_Manual_v07.md).</w:t>
+      </w:r>
+    </w:p>
+    <w:p>
+      <w:r>
+        <w:t xml:space="preserve">2. **Aggiorna il documento Word `.docx`**:</w:t>
+      </w:r>
+    </w:p>
+    <w:p>
+      <w:r>
+        <w:t xml:space="preserve">   - Puoi modificare ed esportare direttamente il file [`AQI_Dashboard_Operating_Manual_v07.docx`](file:///c:/Users/Maria%20Luisa/Desktop/New_Dashboard/AQI_Dashboard_Operating_Manual_v07.docx).</w:t>
+      </w:r>
+    </w:p>
+    <w:p>
+      <w:r>
+        <w:t xml:space="preserve">3. **Commit e Push**: Esegui `git add .`, `git commit` e `git push` per pubblicare la documentazione aggiornata.</w:t>
+      </w:r>
     </w:p>
     <w:sectPr>
       <w:pgSz w:w="11906" w:h="16838"/>

</xml_diff>